<commit_message>
fix(desktop): correct macOS Dock icon; streamline user-facing docs
Stop overriding the padded icon.icns with full-bleed icon.png on launch so
the Dock icon matches other apps. Trim README to point desktop users at
INSTALL, label QUICK_START for developers, and refresh USER_GUIDE,
TROUBLESHOOTING, and INSTALL. Add TDF application form and update the
pre-proposal for the UR Ventures submission.
</commit_message>
<xml_diff>
--- a/proposals/TDF_pre-proposal_NeuroInsight.docx
+++ b/proposals/TDF_pre-proposal_NeuroInsight.docx
@@ -4,6 +4,7 @@
   <w:body>
     <w:p>
       <w:pPr>
+        <w:spacing w:before="0" w:after="40"/>
         <w:jc w:val="center"/>
       </w:pPr>
       <w:r>
@@ -17,7 +18,7 @@
     </w:p>
     <w:p>
       <w:pPr>
-        <w:spacing w:after="200"/>
+        <w:spacing w:before="40" w:after="200"/>
         <w:jc w:val="center"/>
       </w:pPr>
       <w:r>
@@ -25,12 +26,12 @@
           <w:b/>
           <w:sz w:val="24"/>
         </w:rPr>
-        <w:t>Pre-Proposal: NeuroInsight — Turnkey AI Detection of Epilepsy-Causing Brain Lesions</w:t>
+        <w:t>Pre-Proposal: NeuroInsight — A Clinic-Ready Imaging Decision-Support Tool for Epilepsy</w:t>
       </w:r>
     </w:p>
     <w:p>
       <w:pPr>
-        <w:spacing w:after="40"/>
+        <w:spacing w:after="120"/>
       </w:pPr>
       <w:r>
         <w:rPr>
@@ -44,7 +45,7 @@
     </w:p>
     <w:p>
       <w:pPr>
-        <w:spacing w:after="40"/>
+        <w:spacing w:after="120"/>
       </w:pPr>
       <w:r>
         <w:rPr>
@@ -53,26 +54,61 @@
         <w:t>Faculty sponsor / PI:</w:t>
       </w:r>
       <w:r>
-        <w:t xml:space="preserve"> James Gugger, [Department] (to confirm department/title)</w:t>
+        <w:t xml:space="preserve"> James Gugger, [Department] </w:t>
+      </w:r>
+      <w:r>
+        <w:rPr>
+          <w:i/>
+        </w:rPr>
+        <w:t>(to confirm department/title)</w:t>
       </w:r>
     </w:p>
     <w:p>
       <w:pPr>
-        <w:spacing w:after="40"/>
+        <w:spacing w:after="120"/>
       </w:pPr>
       <w:r>
         <w:rPr>
           <w:b/>
         </w:rPr>
-        <w:t>UR Ventures invention disclosure:</w:t>
+        <w:t>Product / platform:</w:t>
       </w:r>
       <w:r>
-        <w:t xml:space="preserve"> Filing in progress (confirm status with UR Ventures)</w:t>
+        <w:t xml:space="preserve"> NeuroInsight (NI) — clinic-ready imaging decision-support platform delivering the Epilepsy Workflow package; current workflows: AutoHS (HS detection) and MELD (FCD detection); v0.1.13 pilot</w:t>
       </w:r>
     </w:p>
     <w:p>
       <w:pPr>
-        <w:spacing w:after="40"/>
+        <w:spacing w:after="120"/>
+      </w:pPr>
+      <w:r>
+        <w:rPr>
+          <w:b/>
+        </w:rPr>
+        <w:t>Core IP (disclosed, in UR Ventures licensing):</w:t>
+      </w:r>
+      <w:r>
+        <w:t xml:space="preserve"> AutoHS — automated hippocampal asymmetry-index detection of hippocampal sclerosis, validated against histopathology-confirmed surgical specimens; validation study provisionally accepted at </w:t>
+      </w:r>
+      <w:r>
+        <w:rPr>
+          <w:i/>
+        </w:rPr>
+        <w:t>Brain Communications</w:t>
+      </w:r>
+      <w:r>
+        <w:t xml:space="preserve"> </w:t>
+      </w:r>
+      <w:r>
+        <w:rPr>
+          <w:i/>
+        </w:rPr>
+        <w:t>(confirm disclosure/eligibility status)</w:t>
+      </w:r>
+    </w:p>
+    <w:p>
+      <w:pPr>
+        <w:spacing w:after="120"/>
       </w:pPr>
       <w:r>
         <w:rPr>
@@ -81,12 +117,12 @@
         <w:t>Requested award:</w:t>
       </w:r>
       <w:r>
-        <w:t xml:space="preserve"> $[40,000–100,000] over 12 months</w:t>
+        <w:t xml:space="preserve"> $80,000 over 12 months</w:t>
       </w:r>
     </w:p>
     <w:p>
       <w:pPr>
-        <w:spacing w:after="40"/>
+        <w:spacing w:after="120"/>
       </w:pPr>
       <w:r>
         <w:rPr>
@@ -97,11 +133,6 @@
       <w:r>
         <w:t xml:space="preserve"> [email] · [phone]</w:t>
       </w:r>
-    </w:p>
-    <w:p>
-      <w:pPr>
-        <w:spacing w:after="40"/>
-      </w:pPr>
     </w:p>
     <w:p>
       <w:pPr>
@@ -121,25 +152,43 @@
         <w:spacing w:after="120"/>
       </w:pPr>
       <w:r>
-        <w:t xml:space="preserve">Roughly one in three people with epilepsy do not respond to medication, and many could be cured by surgery — </w:t>
+        <w:t xml:space="preserve">Powerful, validated neuroimaging methods for epilepsy already exist — but they are trapped in research code that requires Linux, containers, and computing expertise no clinic has, so it rarely reaches patients. </w:t>
+      </w:r>
+      <w:r>
+        <w:rPr>
+          <w:b/>
+        </w:rPr>
+        <w:t>NeuroInsight closes this gap: it is now a desktop app — a clinic-ready platform that any researcher or clinician can install and use. It runs validated imaging workflows at one click on their own computer, keeps patient data on-site, and returns a reviewable result that supports the clinical decision — no programming required.</w:t>
+      </w:r>
+      <w:r>
+        <w:t xml:space="preserve"> NeuroInsight delivers these as an Epilepsy Workflow package, and its current workflows already show both halves of product–market fit: </w:t>
+      </w:r>
+      <w:r>
+        <w:rPr>
+          <w:b/>
+        </w:rPr>
+        <w:t>AutoHS</w:t>
+      </w:r>
+      <w:r>
+        <w:t xml:space="preserve">, a URMC-invented hippocampal-asymmetry detector for hippocampal sclerosis, is validated against histopathology-confirmed surgical specimens (study provisionally accepted at </w:t>
       </w:r>
       <w:r>
         <w:rPr>
           <w:i/>
         </w:rPr>
-        <w:t>if</w:t>
+        <w:t>Brain Communications</w:t>
       </w:r>
       <w:r>
-        <w:t xml:space="preserve"> clinicians can find the small brain lesion causing the seizures. The problem is that these lesions, especially focal cortical dysplasia, are invisible to the human eye on standard MRI in a large fraction of cases. State-of-the-art AI can now detect them, but that AI lives in research code that requires Linux, Docker, and high-performance-computing expertise to run. Epilepsy centers and neuroradiology groups therefore cannot use it. </w:t>
+        <w:t xml:space="preserve">) and is in active licensing discussion with UR Ventures; and </w:t>
       </w:r>
       <w:r>
         <w:rPr>
           <w:b/>
         </w:rPr>
-        <w:t>NeuroInsight packages this detection AI into a one-click application that runs on a clinician's own computer, keeps patient data on-site, and produces a reviewable result — no programming required.</w:t>
+        <w:t>MELD</w:t>
       </w:r>
       <w:r>
-        <w:t xml:space="preserve"> The platform already supports neurologists at URMC; this award would fund the clinical validation, productization, and pilot deployments needed to turn that early adoption into a validated, licensable product.</w:t>
+        <w:t>, our clinic-ready workflow built around an external academic focal-cortical-dysplasia model, already draws 15+ unprompted requests from clinicians across URMC. This award would mature NeuroInsight from a working pilot into a deployable, licensable clinical product.</w:t>
       </w:r>
     </w:p>
     <w:p>
@@ -160,7 +209,22 @@
         <w:spacing w:after="120"/>
       </w:pPr>
       <w:r>
-        <w:t>Drug-resistant epilepsy affects millions worldwide and drives enormous cost in repeated hospitalizations and lost productivity. Surgery can stop seizures, but only when the seizure-causing lesion is localized. Two gaps block this today:</w:t>
+        <w:t>Drug-resistant epilepsy is often curable by surgery, but only when the responsible lesion is found — and the lesions that cause it (hippocampal sclerosis, focal cortical dysplasia) are frequently subtle or missed on standard visual MRI review. Two gaps block progress:</w:t>
+      </w:r>
+    </w:p>
+    <w:p>
+      <w:pPr>
+        <w:pStyle w:val="ListBullet"/>
+        <w:spacing w:after="60"/>
+      </w:pPr>
+      <w:r>
+        <w:rPr>
+          <w:b/>
+        </w:rPr>
+        <w:t>Usability gap (the platform problem).</w:t>
+      </w:r>
+      <w:r>
+        <w:t xml:space="preserve"> Advanced, validated neuroimaging tools (FreeSurfer, fMRIPrep, the MELD pipeline, and research methods like AutoHS) demand command-line skills, container orchestration, and cluster access. Clinicians and most research staff cannot operate them, so validated science never reaches the patients who need it.</w:t>
       </w:r>
     </w:p>
     <w:p>
@@ -175,22 +239,7 @@
         <w:t>Detection gap.</w:t>
       </w:r>
       <w:r>
-        <w:t xml:space="preserve"> Focal cortical dysplasia (FCD) is frequently “MRI-negative” to radiologists. Validated AI models — for example the MELD Graph graph-neural-network detector (Wagstyl et al., 2025) — substantially improve detection, yet remain inaccessible outside a handful of expert informatics labs.</w:t>
-      </w:r>
-    </w:p>
-    <w:p>
-      <w:pPr>
-        <w:pStyle w:val="ListBullet"/>
-        <w:spacing w:after="60"/>
-      </w:pPr>
-      <w:r>
-        <w:rPr>
-          <w:b/>
-        </w:rPr>
-        <w:t>Usability gap.</w:t>
-      </w:r>
-      <w:r>
-        <w:t xml:space="preserve"> Advanced neuroimaging tools (FreeSurfer, fMRIPrep, the MELD pipeline) demand command-line skills, container orchestration, and cluster access. Clinicians and most research staff cannot operate them, so the science never reaches patients.</w:t>
+        <w:t xml:space="preserve"> Even where expertise exists, subtle lesions are under-called. Validated quantitative and AI methods measurably improve detection but stay in the lab.</w:t>
       </w:r>
     </w:p>
     <w:p>
@@ -198,7 +247,7 @@
         <w:spacing w:after="120"/>
       </w:pPr>
       <w:r>
-        <w:t>The result: proven methods sit unused while patients wait. NeuroInsight closes both gaps at once.</w:t>
+        <w:t>NeuroInsight closes the usability gap for the whole package; AutoHS and MELD close the detection gap for the two highest-value epilepsy indications.</w:t>
       </w:r>
     </w:p>
     <w:p>
@@ -219,7 +268,7 @@
         <w:spacing w:after="120"/>
       </w:pPr>
       <w:r>
-        <w:t>NeuroInsight is a working neuroimaging platform (current pilot release v0.1.13) that delivers research-grade AI through a simple desktop application for macOS, Windows, and Linux. Its differentiated, commercially relevant assets are:</w:t>
+        <w:t>NeuroInsight is a working neuroimaging platform (pilot release v0.1.13) for macOS, Windows, and Linux that delivers validated imaging analysis as clinical decision support. It is defensible because:</w:t>
       </w:r>
     </w:p>
     <w:p>
@@ -231,25 +280,10 @@
         <w:rPr>
           <w:b/>
         </w:rPr>
-        <w:t>Clinical detection pipelines, productized.</w:t>
+        <w:t>No-DevOps delivery is the moat.</w:t>
       </w:r>
       <w:r>
-        <w:t xml:space="preserve"> Turnkey workflows for FCD (MELD Graph), tuberous-sclerosis tuber segmentation and burden quantification, and hippocampal-sclerosis detection — delivered as one-click tools rather than research scripts.</w:t>
-      </w:r>
-    </w:p>
-    <w:p>
-      <w:pPr>
-        <w:pStyle w:val="ListBullet"/>
-        <w:spacing w:after="60"/>
-      </w:pPr>
-      <w:r>
-        <w:rPr>
-          <w:b/>
-        </w:rPr>
-        <w:t>No-DevOps delivery.</w:t>
-      </w:r>
-      <w:r>
-        <w:t xml:space="preserve"> The application installs like any consumer app and automatically handles the containers, data movement, and compute that previously required an engineer. This usability layer is the moat: the underlying models are published, but making them usable by clinicians is not.</w:t>
+        <w:t xml:space="preserve"> NeuroInsight installs like a consumer app and automatically handles the containers, data movement, and compute that previously required an engineer. Algorithms can be published; making them usable by clinicians at the point of care is the hard part — and it is the platform's core value.</w:t>
       </w:r>
     </w:p>
     <w:p>
@@ -264,7 +298,7 @@
         <w:t>Local-first data handling.</w:t>
       </w:r>
       <w:r>
-        <w:t xml:space="preserve"> Imaging stays on the user's machine or institution; credentials live in the OS keychain. This design keeps protected health information on-site, easing institutional adoption.</w:t>
+        <w:t xml:space="preserve"> Imaging stays on the user's machine or institution and credentials live in the OS keychain, keeping protected health information on-site and easing institutional adoption.</w:t>
       </w:r>
     </w:p>
     <w:p>
@@ -276,10 +310,43 @@
         <w:rPr>
           <w:b/>
         </w:rPr>
-        <w:t>Extensible by design.</w:t>
+        <w:t>An extensible workflow package.</w:t>
       </w:r>
       <w:r>
-        <w:t xml:space="preserve"> New tools and multi-step pipelines are defined declaratively, so the catalog can grow without re-engineering the product.</w:t>
+        <w:t xml:space="preserve"> NeuroInsight runs the </w:t>
+      </w:r>
+      <w:r>
+        <w:rPr>
+          <w:b/>
+        </w:rPr>
+        <w:t>Epilepsy Workflow package</w:t>
+      </w:r>
+      <w:r>
+        <w:t>; its current workflows are AutoHS (HS detection — URMC IP) and MELD (FCD detection — our workflow around an external academic model, MELD Graph), and new workflows are added without re-engineering the product.</w:t>
+      </w:r>
+    </w:p>
+    <w:p>
+      <w:pPr>
+        <w:pStyle w:val="ListBullet"/>
+        <w:spacing w:after="60"/>
+      </w:pPr>
+      <w:r>
+        <w:rPr>
+          <w:b/>
+        </w:rPr>
+        <w:t>A validated, ownable anchor.</w:t>
+      </w:r>
+      <w:r>
+        <w:t xml:space="preserve"> The flagship workflow, </w:t>
+      </w:r>
+      <w:r>
+        <w:rPr>
+          <w:b/>
+        </w:rPr>
+        <w:t>AutoHS</w:t>
+      </w:r>
+      <w:r>
+        <w:t>, is a concrete URMC invention — validated against histopathology-confirmed surgical specimens, with a provisionally accepted publication and an active UR Ventures licensing path — giving the platform defensible, ownable IP at its core.</w:t>
       </w:r>
     </w:p>
     <w:p>
@@ -287,7 +354,7 @@
         <w:spacing w:after="120"/>
       </w:pPr>
       <w:r>
-        <w:t>Compared with existing options — open-source toolkits (FSL, FreeSurfer, AFNI, SPM) that require expertise, and commercial neuroimaging software that lacks these epilepsy AI detectors — NeuroInsight is, to our knowledge, the only path that puts validated lesion-detection AI in a clinician's hands without DevOps and without sending data to the cloud.</w:t>
+        <w:t>A single NeuroInsight install already covers the two most common surgically-treatable epilepsy lesions — hippocampal sclerosis (AutoHS) and focal cortical dysplasia (MELD) — and the platform builds on established toolkits (it uses FreeSurfer, and runs FSL/AFNI/SPM-class pipelines) rather than competing with them, packaging them for clinicians. Compared with the alternatives — research tools that require command-line expertise, recent academic detectors not delivered as clinician-ready products, and commercial neuroimaging software focused on volumetry rather than epilepsy — NeuroInsight is, to our knowledge, the only path that puts validated epilepsy detectors in a clinician's hands without DevOps and without sending data to the cloud.</w:t>
       </w:r>
     </w:p>
     <w:p>
@@ -312,10 +379,91 @@
         <w:rPr>
           <w:b/>
         </w:rPr>
-        <w:t>Functional product.</w:t>
+        <w:t>Working platform with a clinical package.</w:t>
       </w:r>
       <w:r>
-        <w:t xml:space="preserve"> A feature-complete desktop and web application with 19 working imaging plugins and 8 multi-step workflows, including the epilepsy detection pipelines above.</w:t>
+        <w:t xml:space="preserve"> NeuroInsight is a feature-complete desktop/web application with one-click installers for macOS, Windows, and Linux, already delivering the Epilepsy Workflow package (AutoHS, MELD) in our lab for clinical studies. Download integrity is verified by published SHA-256 checksums; macOS code-signing and notarization are in final testing.</w:t>
+      </w:r>
+    </w:p>
+    <w:p>
+      <w:pPr>
+        <w:pStyle w:val="ListBullet"/>
+        <w:spacing w:after="60"/>
+      </w:pPr>
+      <w:r>
+        <w:rPr>
+          <w:b/>
+        </w:rPr>
+        <w:t>Validated flagship workflow + commercial interest.</w:t>
+      </w:r>
+      <w:r>
+        <w:t xml:space="preserve"> AutoHS is supported by the study </w:t>
+      </w:r>
+      <w:r>
+        <w:rPr>
+          <w:i/>
+        </w:rPr>
+        <w:t>"MRI-derived hippocampal asymmetry identifies hippocampal sclerosis in epilepsy surgical specimens"</w:t>
+      </w:r>
+      <w:r>
+        <w:t xml:space="preserve"> — validated against histopathology-confirmed surgical specimens, provisionally accepted at </w:t>
+      </w:r>
+      <w:r>
+        <w:rPr>
+          <w:i/>
+        </w:rPr>
+        <w:t>Brain Communications</w:t>
+      </w:r>
+      <w:r>
+        <w:t xml:space="preserve"> — and is in active licensing discussion with UR Ventures.</w:t>
+      </w:r>
+    </w:p>
+    <w:p>
+      <w:pPr>
+        <w:pStyle w:val="ListBullet"/>
+        <w:spacing w:after="60"/>
+      </w:pPr>
+      <w:r>
+        <w:rPr>
+          <w:b/>
+        </w:rPr>
+        <w:t>Clinical pull demand, quantified.</w:t>
+      </w:r>
+      <w:r>
+        <w:t xml:space="preserve"> URMC neurologists already send NeuroInsight unprompted requests to run the </w:t>
+      </w:r>
+      <w:r>
+        <w:rPr>
+          <w:b/>
+        </w:rPr>
+        <w:t>MELD</w:t>
+      </w:r>
+      <w:r>
+        <w:t xml:space="preserve"> workflow on their patients' scans — over 15 requests to date, from clinicians across URMC — demonstrating real demand for the package.</w:t>
+      </w:r>
+    </w:p>
+    <w:p>
+      <w:pPr>
+        <w:pStyle w:val="ListBullet"/>
+        <w:spacing w:after="60"/>
+      </w:pPr>
+      <w:r>
+        <w:rPr>
+          <w:b/>
+        </w:rPr>
+        <w:t>Path into clinical decision-making.</w:t>
+      </w:r>
+      <w:r>
+        <w:t xml:space="preserve"> We are integrating NeuroInsight's workflows into URMC's </w:t>
+      </w:r>
+      <w:r>
+        <w:rPr>
+          <w:b/>
+        </w:rPr>
+        <w:t>Patient Presurgical Conference (PRC)</w:t>
+      </w:r>
+      <w:r>
+        <w:t xml:space="preserve"> — the multidisciplinary meeting where epilepsy surgery candidates are decided — moving the platform from a useful aid to part of the decision workflow, and giving us a built-in anchor site.</w:t>
       </w:r>
     </w:p>
     <w:p>
@@ -330,46 +478,7 @@
         <w:t>Validated infrastructure.</w:t>
       </w:r>
       <w:r>
-        <w:t xml:space="preserve"> End-to-end job execution confirmed on local Docker and a remote HPC cluster (SLURM); connectors to institutional imaging archives (XNAT) and the NIH-backed Pennsieve platform.</w:t>
-      </w:r>
-    </w:p>
-    <w:p>
-      <w:pPr>
-        <w:pStyle w:val="ListBullet"/>
-        <w:spacing w:after="60"/>
-      </w:pPr>
-      <w:r>
-        <w:rPr>
-          <w:b/>
-        </w:rPr>
-        <w:t>Distribution in place.</w:t>
-      </w:r>
-      <w:r>
-        <w:t xml:space="preserve"> Native installers for all three desktop platforms; signed/notarized macOS distribution now established, removing a key adoption barrier.</w:t>
-      </w:r>
-    </w:p>
-    <w:p>
-      <w:pPr>
-        <w:pStyle w:val="ListBullet"/>
-        <w:spacing w:after="60"/>
-      </w:pPr>
-      <w:r>
-        <w:rPr>
-          <w:b/>
-        </w:rPr>
-        <w:t>Real clinical users and pull demand already.</w:t>
-      </w:r>
-      <w:r>
-        <w:t xml:space="preserve"> NeuroInsight is already in active use supporting neurologists in URMC's Department of Neurology, who send us requests to run MELD-based FCD detection on their patients' scans — unprompted demand for the exact capability at the core of this proposal. The team is now extending the platform's workflows into URMC's </w:t>
-      </w:r>
-      <w:r>
-        <w:rPr>
-          <w:b/>
-        </w:rPr>
-        <w:t>Patient Presurgical Conference (PRC)</w:t>
-      </w:r>
-      <w:r>
-        <w:t>, the multidisciplinary meeting where epilepsy surgery candidates are reviewed and decided. Embedding results into the PRC moves NeuroInsight from a useful tool to part of the clinical decision-making workflow — and gives us a built-in anchor site for the pilot and validation work below.</w:t>
+        <w:t xml:space="preserve"> End-to-end execution confirmed on local Docker and a remote HPC cluster (SLURM); connectors to institutional imaging archives (XNAT) and the NIH-backed Pennsieve platform.</w:t>
       </w:r>
     </w:p>
     <w:p>
@@ -386,7 +495,7 @@
         <w:t>not</w:t>
       </w:r>
       <w:r>
-        <w:t xml:space="preserve"> yet exist — and is exactly what this award funds — is formal clinical validation, hardened productization, and external pilot evidence beyond our initial URMC users.</w:t>
+        <w:t xml:space="preserve"> yet exist — and is exactly what this award funds — is multi-dataset clinical validation beyond our own studies, hardening for deployment outside our lab, and external pilot evidence beyond URMC.</w:t>
       </w:r>
     </w:p>
     <w:p>
@@ -407,7 +516,7 @@
         <w:spacing w:after="120"/>
       </w:pPr>
       <w:r>
-        <w:t>This award advances NeuroInsight from working prototype to validated, deployable product along four parallel tracks:</w:t>
+        <w:t>This award matures NeuroInsight from a working pilot into a deployable, licensable clinical platform along four parallel tracks:</w:t>
       </w:r>
     </w:p>
     <w:p>
@@ -422,7 +531,7 @@
         <w:t>Clinical validation.</w:t>
       </w:r>
       <w:r>
-        <w:t xml:space="preserve"> Benchmark the FCD/TSC/hippocampal-sclerosis detectors against expert-labeled, retrospective imaging datasets to quantify accuracy and generate the evidence licensees and clinicians require.</w:t>
+        <w:t xml:space="preserve"> Validate the package's detectors — AutoHS first, then MELD/FCD — on independent, expert-labeled, multi-site datasets to quantify accuracy and produce the evidence licensees and clinicians require.</w:t>
       </w:r>
     </w:p>
     <w:p>
@@ -434,10 +543,10 @@
         <w:rPr>
           <w:b/>
         </w:rPr>
-        <w:t>Productization (technical staff).</w:t>
+        <w:t>Platform productization (technical staff).</w:t>
       </w:r>
       <w:r>
-        <w:t xml:space="preserve"> Hire technical staff to harden the application for deployment: remote job monitoring, Windows signing, packaging, reliability, and an installable clinical configuration.</w:t>
+        <w:t xml:space="preserve"> Harden NeuroInsight for deployment outside our lab: workflow packaging, remote job monitoring, Windows signing, reliability, and an installable clinical configuration.</w:t>
       </w:r>
     </w:p>
     <w:p>
@@ -452,7 +561,7 @@
         <w:t>Pilot deployments.</w:t>
       </w:r>
       <w:r>
-        <w:t xml:space="preserve"> Formalize the URMC anchor site by integrating NeuroInsight's epilepsy workflows into the Patient Presurgical Conference, then expand to additional epilepsy centers and imaging core facilities to demonstrate real-world use and secure letters of commercial interest.</w:t>
+        <w:t xml:space="preserve"> Formalize the URMC anchor site by integrating the package into the Patient Presurgical Conference, then expand to additional epilepsy centers and imaging cores to demonstrate real-world use and secure letters of commercial interest.</w:t>
       </w:r>
     </w:p>
     <w:p>
@@ -464,10 +573,10 @@
         <w:rPr>
           <w:b/>
         </w:rPr>
-        <w:t>Market and regulatory validation.</w:t>
+        <w:t>Market validation.</w:t>
       </w:r>
       <w:r>
-        <w:t xml:space="preserve"> Use NSF I-Corps and fee-for-service consulting to confirm customer segments, pricing, the regulatory pathway, and freedom-to-operate / competitive positioning.</w:t>
+        <w:t xml:space="preserve"> Use NSF I-Corps and fee-for-service consulting to confirm customer segments, pricing, freedom-to-operate, and competitive positioning, in coordination with the UR Ventures AutoHS licensing process.</w:t>
       </w:r>
     </w:p>
     <w:p>
@@ -481,7 +590,7 @@
         <w:t>Success at 12 months</w:t>
       </w:r>
       <w:r>
-        <w:t xml:space="preserve"> = validated accuracy metrics on real datasets, a deployment-ready signed product, NeuroInsight workflows operationally integrated into URMC's Patient Presurgical Conference, ≥1–2 external pilots with a letter of commercial interest, and a defined regulatory and go-to-market path — the package needed to pursue licensing or a startup.</w:t>
+        <w:t xml:space="preserve"> = a deployment-ready signed NeuroInsight release, quantified AutoHS accuracy on independent datasets, the Epilepsy Workflow package operationally integrated into URMC's Patient Presurgical Conference, ≥1–2 external pilots with a letter of commercial interest, and a defined go-to-market path — the package needed to complete the AutoHS license and scale the platform.</w:t>
       </w:r>
     </w:p>
     <w:p>
@@ -544,7 +653,7 @@
               <w:rPr>
                 <w:b/>
               </w:rPr>
-              <w:t>Approx.</w:t>
+              <w:t>Amount</w:t>
             </w:r>
           </w:p>
         </w:tc>
@@ -566,7 +675,7 @@
           </w:tcPr>
           <w:p>
             <w:r>
-              <w:t>Developer/research staff for validation + productization</w:t>
+              <w:t>Developer/research staff for platform productization and AutoHS validation</w:t>
             </w:r>
           </w:p>
         </w:tc>
@@ -576,7 +685,7 @@
           </w:tcPr>
           <w:p>
             <w:r>
-              <w:t>$[ ]</w:t>
+              <w:t>$58,000</w:t>
             </w:r>
           </w:p>
         </w:tc>
@@ -598,7 +707,7 @@
           </w:tcPr>
           <w:p>
             <w:r>
-              <w:t>Market/regulatory consulting, I-Corps, dataset/annotation services</w:t>
+              <w:t>I-Corps and market/competitive validation; dataset access, de-identification, and expert annotation</w:t>
             </w:r>
           </w:p>
         </w:tc>
@@ -608,7 +717,7 @@
           </w:tcPr>
           <w:p>
             <w:r>
-              <w:t>$[ ]</w:t>
+              <w:t>$16,000</w:t>
             </w:r>
           </w:p>
         </w:tc>
@@ -630,7 +739,7 @@
           </w:tcPr>
           <w:p>
             <w:r>
-              <w:t>Test compute, storage, pilot support</w:t>
+              <w:t>Cloud/test compute, storage, and pilot-site support</w:t>
             </w:r>
           </w:p>
         </w:tc>
@@ -640,7 +749,7 @@
           </w:tcPr>
           <w:p>
             <w:r>
-              <w:t>$[ ]</w:t>
+              <w:t>$6,000</w:t>
             </w:r>
           </w:p>
         </w:tc>
@@ -663,13 +772,7 @@
           <w:tcPr>
             <w:tcW w:type="dxa" w:w="2880"/>
           </w:tcPr>
-          <w:p>
-            <w:r>
-              <w:rPr>
-                <w:b/>
-              </w:rPr>
-            </w:r>
-          </w:p>
+          <w:p/>
         </w:tc>
         <w:tc>
           <w:tcPr>
@@ -680,7 +783,7 @@
               <w:rPr>
                 <w:b/>
               </w:rPr>
-              <w:t>$[40–100K]</w:t>
+              <w:t>$80,000</w:t>
             </w:r>
           </w:p>
         </w:tc>
@@ -688,7 +791,7 @@
     </w:tbl>
     <w:p>
       <w:pPr>
-        <w:spacing w:before="80"/>
+        <w:spacing w:after="120"/>
       </w:pPr>
       <w:r>
         <w:rPr>
@@ -707,7 +810,7 @@
           <w:color w:val="1F3864"/>
           <w:sz w:val="25"/>
         </w:rPr>
-        <w:t>7. Market and impact on neuroimaging analysis</w:t>
+        <w:t>7. Impact</w:t>
       </w:r>
     </w:p>
     <w:p>
@@ -715,15 +818,7 @@
         <w:spacing w:after="120"/>
       </w:pPr>
       <w:r>
-        <w:t>Primary customers are epilepsy surgery centers, neuroradiology practices, and academic imaging cores — on the order of thousands of sites globally, with expansion across the broader neuroimaging tool market and adjacent rare-disease indications (e.g., tuberous sclerosis). The clinical detection tools are the wedge; the platform is the durable delivery channel for a growing catalog.</w:t>
-      </w:r>
-    </w:p>
-    <w:p>
-      <w:pPr>
-        <w:spacing w:after="120"/>
-      </w:pPr>
-      <w:r>
-        <w:t>The larger impact is on how neuroimaging analysis gets done. Today, advanced analysis is gated by technical skill: the best pipelines run only where a lab employs someone fluent in Linux, containers, and clusters. NeuroInsight removes that gate, letting any clinician or researcher run validated, reproducible pipelines from their own computer. This shortens the path from imaging-research method to patient care from years to weeks, standardizes how analyses are run across sites, and lets new AI models reach front-line users as soon as they are published. Epilepsy is where we prove this; the same engine extends to structural, functional, and diffusion MRI across neuroscience — turning advanced neuroimaging analysis from an expert-only activity into routine infrastructure.</w:t>
+        <w:t>For epilepsy care, NeuroInsight means subtle, surgically-relevant lesions are far less likely to be missed, because validated detectors — starting with AutoHS — reach the clinicians making surgical decisions instead of staying in a research repository. More broadly, NeuroInsight changes how neuroimaging analysis gets done: today the best pipelines run only where a lab employs someone fluent in Linux, containers, and clusters; NeuroInsight removes that gate, letting any clinician or researcher run validated, reproducible analyses from their own computer. This shortens the path from imaging-research method to patient care, standardizes how analyses are run across sites, and lets newly published models reach front-line users quickly. Epilepsy is where we prove the model; the same platform extends to other detectors and to structural, functional, and diffusion MRI across neuroscience.</w:t>
       </w:r>
     </w:p>
     <w:p>
@@ -747,13 +842,15 @@
         <w:t>The lead applicant, a Research Data Engineer who architected and built the NeuroInsight platform, will direct the project with appropriate effort, supported by faculty sponsor James Gugger and UR Ventures. The team commits to NSF I-Corps participation, regular UR Ventures progress reviews, and the Fund's revenue-sharing terms.</w:t>
       </w:r>
     </w:p>
-    <w:p/>
     <w:p>
+      <w:pPr>
+        <w:spacing w:after="120"/>
+      </w:pPr>
       <w:r>
         <w:rPr>
           <w:i/>
         </w:rPr>
-        <w:t>Open items to finalize before submission: (1) confirm invention disclosure is on file with UR Ventures; (2) confirm James Gugger's department/title and his agreement to sponsor; (3) fill department, budget figures, and contact details; (4) secure at least one letter of commercial interest — your existing URMC Neurology users (e.g., via James Gugger) are the natural first ask.</w:t>
+        <w:t>Open items to finalize before submission: (1) confirm AutoHS invention-disclosure status with UR Ventures, and confirm the active licensing discussion does not affect TDF eligibility (the fund excludes technologies with existing licensing options/agreements); (2) confirm James Gugger's department/title and his agreement to sponsor; (3) fill department and contact details; (4) secure at least one letter of commercial interest — your URMC Neurology PRC users (via James Gugger) are the natural first ask.</w:t>
       </w:r>
     </w:p>
     <w:sectPr>

</xml_diff>